<commit_message>
Instrukcja: tłumaczenie ze słuchu to inny tryb niż "przetłumacz to"
Za cztery dni okulary jadą do kolejnej osoby testującej, a te dwie funkcje
nazywają się prawie tak samo i robią co innego: tamta tłumaczy NAPIS, na który
patrzysz, i kończy się jedną odpowiedzią; ta tłumaczy ROZMOWĘ, której słuchasz,
i trwa, dopóki się jej nie wyłączy.

Nowa ramka mówi wprost: czym się włącza, czym wyłącza (i czemu "koniec" w
środku zdania nie wystarczy), gdzie ustawia się oba języki, że pierwsza para
dociąga pakiet circa 30 MB, że tłumaczenie idzie po skończonych zdaniach, a
nie słowo w słowo, i że tryb sam się wyłącza po dłuższej ciszy.

docx przeliczony: 166 fragmentów treści, 0 brakujących.

Co-Authored-By: Claude Opus 5 <noreply@anthropic.com>
Claude-Session: https://claude.ai/code/session_015mXWx3ExWgyckpkYb6Wo3b
</commit_message>
<xml_diff>
--- a/docs/instrukcja-dla-osob-testujacych.docx
+++ b/docs/instrukcja-dla-osob-testujacych.docx
@@ -950,6 +950,187 @@
           <w:iCs w:val="false"/>
         </w:rPr>
         <w:t xml:space="preserve">Na dłuższy tekst — stronę ulotki, całe menu — to nie jest przeznaczone. Do tego włącz tryb czytania („Czytaj tekst na głos”, sekcja 06) albo po prostu zapytaj głosem.</w:t>
+      </w:r>
+    </w:p>
+    <w:p>
+      <w:pPr>
+        <w:shd w:fill="F2F3F1" w:color="auto" w:val="clear"/>
+        <w:spacing w:after="60" w:before="200" w:line="276"/>
+        <w:ind w:left="170" w:right="170"/>
+      </w:pPr>
+      <w:r>
+        <w:rPr>
+          <w:b/>
+          <w:bCs/>
+          <w:color w:val="00719F"/>
+        </w:rPr>
+        <w:t xml:space="preserve">Tłumaczenie ze słuchu — tryb ciągły</w:t>
+      </w:r>
+    </w:p>
+    <w:p>
+      <w:pPr>
+        <w:shd w:fill="F2F3F1" w:color="auto" w:val="clear"/>
+        <w:spacing w:after="80" w:before="0" w:line="276"/>
+        <w:ind w:left="170" w:right="170"/>
+      </w:pPr>
+      <w:r>
+        <w:rPr>
+          <w:i w:val="false"/>
+          <w:iCs w:val="false"/>
+        </w:rPr>
+        <w:t xml:space="preserve">To co innego niż „przetłumacz to”. Tamto tłumaczy </w:t>
+      </w:r>
+      <w:r>
+        <w:rPr>
+          <w:b/>
+          <w:bCs/>
+          <w:i w:val="false"/>
+          <w:iCs w:val="false"/>
+        </w:rPr>
+        <w:t xml:space="preserve">napis</w:t>
+      </w:r>
+      <w:r>
+        <w:rPr>
+          <w:i w:val="false"/>
+          <w:iCs w:val="false"/>
+        </w:rPr>
+        <w:t xml:space="preserve">, na który patrzysz, i kończy się jedną odpowiedzią. To tłumaczy </w:t>
+      </w:r>
+      <w:r>
+        <w:rPr>
+          <w:b/>
+          <w:bCs/>
+          <w:i w:val="false"/>
+          <w:iCs w:val="false"/>
+        </w:rPr>
+        <w:t xml:space="preserve">rozmowę, której słuchasz</w:t>
+      </w:r>
+      <w:r>
+        <w:rPr>
+          <w:i w:val="false"/>
+          <w:iCs w:val="false"/>
+        </w:rPr>
+        <w:t xml:space="preserve"> — i nie kończy się, dopóki go nie wyłączysz.</w:t>
+      </w:r>
+    </w:p>
+    <w:p>
+      <w:pPr>
+        <w:shd w:fill="F2F3F1" w:color="auto" w:val="clear"/>
+        <w:spacing w:after="80" w:before="0" w:line="276"/>
+        <w:ind w:left="170" w:right="170"/>
+      </w:pPr>
+      <w:r>
+        <w:rPr>
+          <w:i w:val="false"/>
+          <w:iCs w:val="false"/>
+        </w:rPr>
+        <w:t xml:space="preserve">Włączasz mówiąc </w:t>
+      </w:r>
+      <w:r>
+        <w:rPr>
+          <w:b/>
+          <w:bCs/>
+          <w:i w:val="false"/>
+          <w:iCs w:val="false"/>
+        </w:rPr>
+        <w:t xml:space="preserve">„tłumaczenie na żywo”</w:t>
+      </w:r>
+      <w:r>
+        <w:rPr>
+          <w:i w:val="false"/>
+          <w:iCs w:val="false"/>
+        </w:rPr>
+        <w:t xml:space="preserve"> (działa też „włącz tłumacza ze słuchu”, „tłumacz mi na bieżąco”). Od tej chwili wszystko, co słychać wokół okularów, wraca Ci do ucha po polsku, zdanie po zdaniu.</w:t>
+      </w:r>
+    </w:p>
+    <w:p>
+      <w:pPr>
+        <w:shd w:fill="F2F3F1" w:color="auto" w:val="clear"/>
+        <w:spacing w:after="80" w:before="0" w:line="276"/>
+        <w:ind w:left="170" w:right="170"/>
+      </w:pPr>
+      <w:r>
+        <w:rPr>
+          <w:i w:val="false"/>
+          <w:iCs w:val="false"/>
+        </w:rPr>
+        <w:t xml:space="preserve">Wyłączasz mówiąc </w:t>
+      </w:r>
+      <w:r>
+        <w:rPr>
+          <w:b/>
+          <w:bCs/>
+          <w:i w:val="false"/>
+          <w:iCs w:val="false"/>
+        </w:rPr>
+        <w:t xml:space="preserve">„koniec tłumaczenia”</w:t>
+      </w:r>
+      <w:r>
+        <w:rPr>
+          <w:i w:val="false"/>
+          <w:iCs w:val="false"/>
+        </w:rPr>
+        <w:t xml:space="preserve"> (albo „przestań tłumaczyć”, „wyłącz tłumacza”). Musisz powiedzieć samo to zdanie — słowo „koniec” w środku innego zdania trybu nie wyłączy, bo w tym trybie z założenia słychać cudzą mowę.</w:t>
+      </w:r>
+    </w:p>
+    <w:p>
+      <w:pPr>
+        <w:shd w:fill="F2F3F1" w:color="auto" w:val="clear"/>
+        <w:spacing w:after="80" w:before="0" w:line="276"/>
+        <w:ind w:left="170" w:right="170"/>
+      </w:pPr>
+      <w:r>
+        <w:rPr>
+          <w:b/>
+          <w:bCs/>
+          <w:i w:val="false"/>
+          <w:iCs w:val="false"/>
+        </w:rPr>
+        <w:t xml:space="preserve">Języki ustawiasz raz</w:t>
+      </w:r>
+      <w:r>
+        <w:rPr>
+          <w:i w:val="false"/>
+          <w:iCs w:val="false"/>
+        </w:rPr>
+        <w:t xml:space="preserve">, w Ustawieniach, sekcja „Tłumaczenie ze słuchu”: osobno „słucham w języku” i osobno „mówię do ucha w języku”. Domyślnie jest angielski na polski. Przy pierwszej parze języków telefon dociąga pakiet tłumaczenia (circa 30 MB) — potem działa bez internetu.</w:t>
+      </w:r>
+    </w:p>
+    <w:p>
+      <w:pPr>
+        <w:shd w:fill="F2F3F1" w:color="auto" w:val="clear"/>
+        <w:spacing w:after="80" w:before="0" w:line="276"/>
+        <w:ind w:left="170" w:right="170"/>
+      </w:pPr>
+      <w:r>
+        <w:rPr>
+          <w:b/>
+          <w:bCs/>
+          <w:i w:val="false"/>
+          <w:iCs w:val="false"/>
+        </w:rPr>
+        <w:t xml:space="preserve">Czego się spodziewać:</w:t>
+      </w:r>
+      <w:r>
+        <w:rPr>
+          <w:i w:val="false"/>
+          <w:iCs w:val="false"/>
+        </w:rPr>
+        <w:t xml:space="preserve"> tłumaczenie idzie po kawałku, po każdym skończonym zdaniu, a nie słowo w słowo na żywo. Gdy przez dłuższą chwilę nic nie słychać, tryb sam się wyłącza i mówi o tym — trzyma mikrofon, więc zostawiony włączony w kieszeni zjadałby baterię.</w:t>
+      </w:r>
+    </w:p>
+    <w:p>
+      <w:pPr>
+        <w:shd w:fill="F2F3F1" w:color="auto" w:val="clear"/>
+        <w:spacing w:after="220" w:before="0" w:line="276"/>
+        <w:ind w:left="170" w:right="170"/>
+      </w:pPr>
+      <w:r>
+        <w:rPr>
+          <w:i w:val="false"/>
+          <w:iCs w:val="false"/>
+        </w:rPr>
+        <w:t xml:space="preserve">Tryb nie pyta AI i nie zużywa tokenów.</w:t>
       </w:r>
     </w:p>
     <w:p>

</xml_diff>